<commit_message>
Ficha: texto breve de contexto e interpretación antes de cada tabla
Cada sección vuelve a llevar un párrafo automático (qué muestra la tabla,
cómo leerla y el resultado principal del trimestre). Se regenera la ficha
2026_T2 con el nuevo formato.

Co-Authored-By: Claude Opus 5.5 <noreply@anthropic.com>
Claude-Session: https://claude.ai/code/session_012ZRna6Aa9yLYTt41AwAdbe
</commit_message>
<xml_diff>
--- a/docs/fichas/ficha_2026_T2.docx
+++ b/docs/fichas/ficha_2026_T2.docx
@@ -61,6 +61,74 @@
           <w:sz w:val="18"/>
         </w:rPr>
         <w:t xml:space="preserve">  —  Último trimestre disponible vs mismo trimestre del año anterior</w:t>
+      </w:r>
+    </w:p>
+    <w:p>
+      <w:pPr>
+        <w:spacing w:before="60" w:after="100"/>
+      </w:pPr>
+      <w:r>
+        <w:rPr>
+          <w:rFonts w:ascii="Calibri" w:hAnsi="Calibri"/>
+          <w:b w:val="0"/>
+          <w:i w:val="0"/>
+          <w:sz w:val="20"/>
+        </w:rPr>
+        <w:t xml:space="preserve">La TD es el porcentaje de la población económicamente activa que no tiene trabajo y lo busca; una variación negativa es favorable. En el T2 2026 Jalisco registró </w:t>
+      </w:r>
+      <w:r>
+        <w:rPr>
+          <w:rFonts w:ascii="Calibri" w:hAnsi="Calibri"/>
+          <w:b/>
+          <w:i w:val="0"/>
+          <w:sz w:val="20"/>
+        </w:rPr>
+        <w:t>2.43%</w:t>
+      </w:r>
+      <w:r>
+        <w:rPr>
+          <w:rFonts w:ascii="Calibri" w:hAnsi="Calibri"/>
+          <w:b w:val="0"/>
+          <w:i w:val="0"/>
+          <w:sz w:val="20"/>
+        </w:rPr>
+        <w:t xml:space="preserve"> (</w:t>
+      </w:r>
+      <w:r>
+        <w:rPr>
+          <w:rFonts w:ascii="Calibri" w:hAnsi="Calibri"/>
+          <w:b/>
+          <w:i w:val="0"/>
+          <w:sz w:val="20"/>
+        </w:rPr>
+        <w:t>−0.28 pp</w:t>
+      </w:r>
+      <w:r>
+        <w:rPr>
+          <w:rFonts w:ascii="Calibri" w:hAnsi="Calibri"/>
+          <w:b w:val="0"/>
+          <w:i w:val="0"/>
+          <w:sz w:val="20"/>
+        </w:rPr>
+        <w:t xml:space="preserve"> frente al T2 2025) y se ubicó </w:t>
+      </w:r>
+      <w:r>
+        <w:rPr>
+          <w:rFonts w:ascii="Calibri" w:hAnsi="Calibri"/>
+          <w:b/>
+          <w:i w:val="0"/>
+          <w:sz w:val="20"/>
+        </w:rPr>
+        <w:t>0.22 pp por debajo</w:t>
+      </w:r>
+      <w:r>
+        <w:rPr>
+          <w:rFonts w:ascii="Calibri" w:hAnsi="Calibri"/>
+          <w:b w:val="0"/>
+          <w:i w:val="0"/>
+          <w:sz w:val="20"/>
+        </w:rPr>
+        <w:t xml:space="preserve"> del promedio nacional (2.65%).</w:t>
       </w:r>
     </w:p>
     <w:p>
@@ -473,6 +541,38 @@
           <w:sz w:val="18"/>
         </w:rPr>
         <w:t xml:space="preserve">  —  TD de Jalisco vs entidades federativas — T2 2026</w:t>
+      </w:r>
+    </w:p>
+    <w:p>
+      <w:pPr>
+        <w:spacing w:before="60" w:after="100"/>
+      </w:pPr>
+      <w:r>
+        <w:rPr>
+          <w:rFonts w:ascii="Calibri" w:hAnsi="Calibri"/>
+          <w:b w:val="0"/>
+          <w:i w:val="0"/>
+          <w:sz w:val="20"/>
+        </w:rPr>
+        <w:t xml:space="preserve">Las 32 entidades se ordenan de menor a mayor TD (lugar 1 = menor desocupación). Jalisco ocupa el </w:t>
+      </w:r>
+      <w:r>
+        <w:rPr>
+          <w:rFonts w:ascii="Calibri" w:hAnsi="Calibri"/>
+          <w:b/>
+          <w:i w:val="0"/>
+          <w:sz w:val="20"/>
+        </w:rPr>
+        <w:t>lugar 15 de 32</w:t>
+      </w:r>
+      <w:r>
+        <w:rPr>
+          <w:rFonts w:ascii="Calibri" w:hAnsi="Calibri"/>
+          <w:b w:val="0"/>
+          <w:i w:val="0"/>
+          <w:sz w:val="20"/>
+        </w:rPr>
+        <w:t>, en la parte media de la tabla. Una TD baja no siempre indica un mejor mercado laboral: las cinco entidades con menor TD tienen una informalidad promedio de 66.0% (nacional: 55.1%).</w:t>
       </w:r>
     </w:p>
     <w:p>
@@ -1477,6 +1577,57 @@
         <w:t>Comparativo Regional — Occidente / Centro-Bajío (T2 2026)</w:t>
       </w:r>
     </w:p>
+    <w:p>
+      <w:pPr>
+        <w:keepNext/>
+        <w:spacing w:before="60" w:after="100"/>
+      </w:pPr>
+      <w:r>
+        <w:rPr>
+          <w:rFonts w:ascii="Calibri" w:hAnsi="Calibri"/>
+          <w:b w:val="0"/>
+          <w:i w:val="0"/>
+          <w:sz w:val="20"/>
+        </w:rPr>
+        <w:t xml:space="preserve">Compara a Jalisco con las 8 entidades de la región; la última columna es la distancia a la media regional (negativo = menor desocupación que la media). Jalisco ocupa el </w:t>
+      </w:r>
+      <w:r>
+        <w:rPr>
+          <w:rFonts w:ascii="Calibri" w:hAnsi="Calibri"/>
+          <w:b/>
+          <w:i w:val="0"/>
+          <w:sz w:val="20"/>
+        </w:rPr>
+        <w:t>4° lugar</w:t>
+      </w:r>
+      <w:r>
+        <w:rPr>
+          <w:rFonts w:ascii="Calibri" w:hAnsi="Calibri"/>
+          <w:b w:val="0"/>
+          <w:i w:val="0"/>
+          <w:sz w:val="20"/>
+        </w:rPr>
+        <w:t xml:space="preserve"> con menor TD y está </w:t>
+      </w:r>
+      <w:r>
+        <w:rPr>
+          <w:rFonts w:ascii="Calibri" w:hAnsi="Calibri"/>
+          <w:b/>
+          <w:i w:val="0"/>
+          <w:sz w:val="20"/>
+        </w:rPr>
+        <w:t>prácticamente en la media</w:t>
+      </w:r>
+      <w:r>
+        <w:rPr>
+          <w:rFonts w:ascii="Calibri" w:hAnsi="Calibri"/>
+          <w:b w:val="0"/>
+          <w:i w:val="0"/>
+          <w:sz w:val="20"/>
+        </w:rPr>
+        <w:t xml:space="preserve"> (2.45%).</w:t>
+      </w:r>
+    </w:p>
     <w:tbl>
       <w:tblPr>
         <w:tblStyle w:val="TableGrid"/>
@@ -2389,6 +2540,39 @@
         <w:t xml:space="preserve">  —  Comparativo anual: T2 2026 vs T2 2025 — Jalisco</w:t>
       </w:r>
     </w:p>
+    <w:p>
+      <w:pPr>
+        <w:keepNext/>
+        <w:spacing w:before="60" w:after="100"/>
+      </w:pPr>
+      <w:r>
+        <w:rPr>
+          <w:rFonts w:ascii="Calibri" w:hAnsi="Calibri"/>
+          <w:b w:val="0"/>
+          <w:i w:val="0"/>
+          <w:sz w:val="20"/>
+        </w:rPr>
+        <w:t xml:space="preserve">Complementan la lectura de la TD: la TPEA indica qué parte de la población de 15 años y más trabaja o busca trabajo; la TIL1, qué parte de los ocupados es informal, y la subocupación, qué parte de los ocupados necesita trabajar más horas. Frente al T2 2025: </w:t>
+      </w:r>
+      <w:r>
+        <w:rPr>
+          <w:rFonts w:ascii="Calibri" w:hAnsi="Calibri"/>
+          <w:b/>
+          <w:i w:val="0"/>
+          <w:sz w:val="20"/>
+        </w:rPr>
+        <w:t>TD −0.28 pp, TPEA −1.5 pp, TIL1 +1.2 pp, Subocupación +0.7 pp</w:t>
+      </w:r>
+      <w:r>
+        <w:rPr>
+          <w:rFonts w:ascii="Calibri" w:hAnsi="Calibri"/>
+          <w:b w:val="0"/>
+          <w:i w:val="0"/>
+          <w:sz w:val="20"/>
+        </w:rPr>
+        <w:t>. La baja de la TD coincide con una menor participación: parte de la mejora puede deberse a que menos personas buscan empleo, no solo a más contratación. La informalidad se mantiene 8.6 pp por debajo del promedio nacional.</w:t>
+      </w:r>
+    </w:p>
     <w:tbl>
       <w:tblPr>
         <w:tblStyle w:val="TableGrid"/>
@@ -2969,6 +3153,75 @@
         <w:t>Indicadores por Sexo — Jalisco T2 2026</w:t>
       </w:r>
     </w:p>
+    <w:p>
+      <w:pPr>
+        <w:keepNext/>
+        <w:spacing w:before="60" w:after="100"/>
+      </w:pPr>
+      <w:r>
+        <w:rPr>
+          <w:rFonts w:ascii="Calibri" w:hAnsi="Calibri"/>
+          <w:b w:val="0"/>
+          <w:i w:val="0"/>
+          <w:sz w:val="20"/>
+        </w:rPr>
+        <w:t>La brecha M−H es la tasa de las mujeres menos la de los hombres (negativo = menor en mujeres). La TD de las mujeres (</w:t>
+      </w:r>
+      <w:r>
+        <w:rPr>
+          <w:rFonts w:ascii="Calibri" w:hAnsi="Calibri"/>
+          <w:b/>
+          <w:i w:val="0"/>
+          <w:sz w:val="20"/>
+        </w:rPr>
+        <w:t>1.65%</w:t>
+      </w:r>
+      <w:r>
+        <w:rPr>
+          <w:rFonts w:ascii="Calibri" w:hAnsi="Calibri"/>
+          <w:b w:val="0"/>
+          <w:i w:val="0"/>
+          <w:sz w:val="20"/>
+        </w:rPr>
+        <w:t>) es menor que la de los hombres (</w:t>
+      </w:r>
+      <w:r>
+        <w:rPr>
+          <w:rFonts w:ascii="Calibri" w:hAnsi="Calibri"/>
+          <w:b/>
+          <w:i w:val="0"/>
+          <w:sz w:val="20"/>
+        </w:rPr>
+        <w:t>2.93%</w:t>
+      </w:r>
+      <w:r>
+        <w:rPr>
+          <w:rFonts w:ascii="Calibri" w:hAnsi="Calibri"/>
+          <w:b w:val="0"/>
+          <w:i w:val="0"/>
+          <w:sz w:val="20"/>
+        </w:rPr>
+        <w:t xml:space="preserve">), pero su participación es </w:t>
+      </w:r>
+      <w:r>
+        <w:rPr>
+          <w:rFonts w:ascii="Calibri" w:hAnsi="Calibri"/>
+          <w:b/>
+          <w:i w:val="0"/>
+          <w:sz w:val="20"/>
+        </w:rPr>
+        <w:t>29.8 pp menor</w:t>
+      </w:r>
+      <w:r>
+        <w:rPr>
+          <w:rFonts w:ascii="Calibri" w:hAnsi="Calibri"/>
+          <w:b w:val="0"/>
+          <w:i w:val="0"/>
+          <w:sz w:val="20"/>
+        </w:rPr>
+        <w:t xml:space="preserve"> (42.3% vs 72.1%): la TD de cada grupo debe leerse junto con su participación.</w:t>
+      </w:r>
+    </w:p>
     <w:tbl>
       <w:tblPr>
         <w:tblStyle w:val="TableGrid"/>
@@ -3527,7 +3780,6 @@
     </w:p>
     <w:p>
       <w:pPr>
-        <w:keepNext/>
         <w:spacing w:before="60" w:after="60"/>
       </w:pPr>
       <w:r>
@@ -3538,6 +3790,57 @@
           <w:sz w:val="20"/>
         </w:rPr>
         <w:t>Variación anual por sexo (T2 2025 → T2 2026, pp):</w:t>
+      </w:r>
+    </w:p>
+    <w:p>
+      <w:pPr>
+        <w:keepNext/>
+        <w:spacing w:before="0" w:after="60"/>
+      </w:pPr>
+      <w:r>
+        <w:rPr>
+          <w:rFonts w:ascii="Calibri" w:hAnsi="Calibri"/>
+          <w:b w:val="0"/>
+          <w:i w:val="0"/>
+          <w:sz w:val="20"/>
+        </w:rPr>
+        <w:t xml:space="preserve">Cambio en puntos porcentuales frente al T2 2025 (positivo = aumento). La TD de las mujeres </w:t>
+      </w:r>
+      <w:r>
+        <w:rPr>
+          <w:rFonts w:ascii="Calibri" w:hAnsi="Calibri"/>
+          <w:b/>
+          <w:i w:val="0"/>
+          <w:sz w:val="20"/>
+        </w:rPr>
+        <w:t>bajó 0.79 pp</w:t>
+      </w:r>
+      <w:r>
+        <w:rPr>
+          <w:rFonts w:ascii="Calibri" w:hAnsi="Calibri"/>
+          <w:b w:val="0"/>
+          <w:i w:val="0"/>
+          <w:sz w:val="20"/>
+        </w:rPr>
+        <w:t xml:space="preserve"> y la de los hombres </w:t>
+      </w:r>
+      <w:r>
+        <w:rPr>
+          <w:rFonts w:ascii="Calibri" w:hAnsi="Calibri"/>
+          <w:b/>
+          <w:i w:val="0"/>
+          <w:sz w:val="20"/>
+        </w:rPr>
+        <w:t>subió 0.05 pp</w:t>
+      </w:r>
+      <w:r>
+        <w:rPr>
+          <w:rFonts w:ascii="Calibri" w:hAnsi="Calibri"/>
+          <w:b w:val="0"/>
+          <w:i w:val="0"/>
+          <w:sz w:val="20"/>
+        </w:rPr>
+        <w:t>.</w:t>
       </w:r>
     </w:p>
     <w:tbl>
@@ -3929,6 +4232,39 @@
           <w:sz w:val="18"/>
         </w:rPr>
         <w:t xml:space="preserve">  —  Personas y variación (absoluta y %)</w:t>
+      </w:r>
+    </w:p>
+    <w:p>
+      <w:pPr>
+        <w:keepNext/>
+        <w:spacing w:before="60" w:after="100"/>
+      </w:pPr>
+      <w:r>
+        <w:rPr>
+          <w:rFonts w:ascii="Calibri" w:hAnsi="Calibri"/>
+          <w:b w:val="0"/>
+          <w:i w:val="0"/>
+          <w:sz w:val="20"/>
+        </w:rPr>
+        <w:t xml:space="preserve">Personas ocupadas y su cambio respecto al cierre del año anterior (T4 2025), al mismo trimestre del año anterior (T2 2025; la comparación más limpia porque elimina el efecto estacional) y al trimestre anterior (T1 2026). En el último año la población ocupada </w:t>
+      </w:r>
+      <w:r>
+        <w:rPr>
+          <w:rFonts w:ascii="Calibri" w:hAnsi="Calibri"/>
+          <w:b/>
+          <w:i w:val="0"/>
+          <w:sz w:val="20"/>
+        </w:rPr>
+        <w:t>disminuyó en 52,020 personas (−1.3%)</w:t>
+      </w:r>
+      <w:r>
+        <w:rPr>
+          <w:rFonts w:ascii="Calibri" w:hAnsi="Calibri"/>
+          <w:b w:val="0"/>
+          <w:i w:val="0"/>
+          <w:sz w:val="20"/>
+        </w:rPr>
+        <w:t>. Por actividad, los mayores aumentos anuales fueron en Construcción (+37,219) y Servicios diversos (+29,074); las mayores caídas, en Comercio (−44,717) y Servicios sociales (−27,327).</w:t>
       </w:r>
     </w:p>
     <w:tbl>

</xml_diff>